<commit_message>
Refine IMRaD manuscript references
</commit_message>
<xml_diff>
--- a/deliverables/conference_submission_imrad_draft/conference_manuscript_imrad_with_figures.docx
+++ b/deliverables/conference_submission_imrad_draft/conference_manuscript_imrad_with_figures.docx
@@ -1191,7 +1191,7 @@
         <w:t xml:space="preserve"> </w:t>
       </w:r>
       <w:r>
-        <w:t xml:space="preserve">The citations identify the model families and reports, but they are not evidence for</w:t>
+        <w:t xml:space="preserve">The citations identify the model families, reports, and model card, but they are not evidence for</w:t>
       </w:r>
       <w:r>
         <w:t xml:space="preserve"> </w:t>
@@ -4009,7 +4009,7 @@
         <w:t xml:space="preserve"> </w:t>
       </w:r>
       <w:r>
-        <w:t xml:space="preserve">in Proc. ICML, 2021.</w:t>
+        <w:t xml:space="preserve">in Proc. 38th International Conference on Machine Learning (ICML), Proc. Mach. Learn. Res., vol. 139, pp. 8748-8763, 2021.</w:t>
       </w:r>
     </w:p>
     <w:p>
@@ -4029,7 +4029,7 @@
         <w:t xml:space="preserve"> </w:t>
       </w:r>
       <w:r>
-        <w:t xml:space="preserve">arXiv:2204.14198, 2022.</w:t>
+        <w:t xml:space="preserve">in Advances in Neural Information Processing Systems 35 (NeurIPS), pp. 23716-23736, 2022.</w:t>
       </w:r>
     </w:p>
     <w:p>
@@ -4049,7 +4049,7 @@
         <w:t xml:space="preserve"> </w:t>
       </w:r>
       <w:r>
-        <w:t xml:space="preserve">in Proc. ICML, 2023.</w:t>
+        <w:t xml:space="preserve">in Proc. 40th International Conference on Machine Learning (ICML), Proc. Mach. Learn. Res., vol. 202, pp. 19730-19742, 2023.</w:t>
       </w:r>
     </w:p>
     <w:p>
@@ -4069,7 +4069,7 @@
         <w:t xml:space="preserve"> </w:t>
       </w:r>
       <w:r>
-        <w:t xml:space="preserve">arXiv:2304.08485, 2023.</w:t>
+        <w:t xml:space="preserve">in Advances in Neural Information Processing Systems 36 (NeurIPS), pp. 34892-34916, 2023.</w:t>
       </w:r>
     </w:p>
     <w:p>
@@ -4089,7 +4089,7 @@
         <w:t xml:space="preserve"> </w:t>
       </w:r>
       <w:r>
-        <w:t xml:space="preserve">arXiv:2310.03744, 2023.</w:t>
+        <w:t xml:space="preserve">in Proc. IEEE/CVF Conference on Computer Vision and Pattern Recognition (CVPR), pp. 26296-26306, 2024.</w:t>
       </w:r>
     </w:p>
     <w:p>
@@ -4109,7 +4109,7 @@
         <w:t xml:space="preserve"> </w:t>
       </w:r>
       <w:r>
-        <w:t xml:space="preserve">in Proc. CVPR, 2017.</w:t>
+        <w:t xml:space="preserve">in Proc. IEEE Conference on Computer Vision and Pattern Recognition (CVPR), 2017.</w:t>
       </w:r>
     </w:p>
     <w:p>
@@ -4129,7 +4129,7 @@
         <w:t xml:space="preserve"> </w:t>
       </w:r>
       <w:r>
-        <w:t xml:space="preserve">in Proc. CVPR, 2018.</w:t>
+        <w:t xml:space="preserve">in Proc. IEEE/CVF Conference on Computer Vision and Pattern Recognition (CVPR), 2018.</w:t>
       </w:r>
     </w:p>
     <w:p>
@@ -4149,7 +4149,7 @@
         <w:t xml:space="preserve"> </w:t>
       </w:r>
       <w:r>
-        <w:t xml:space="preserve">arXiv:2305.10355, 2023.</w:t>
+        <w:t xml:space="preserve">in Proc. 2023 Conference on Empirical Methods in Natural Language Processing (EMNLP), pp. 292-305, 2023.</w:t>
       </w:r>
     </w:p>
     <w:p>
@@ -4169,7 +4169,7 @@
         <w:t xml:space="preserve"> </w:t>
       </w:r>
       <w:r>
-        <w:t xml:space="preserve">arXiv:2310.14566, 2023.</w:t>
+        <w:t xml:space="preserve">in Proc. IEEE/CVF Conference on Computer Vision and Pattern Recognition (CVPR), pp. 14375-14385, 2024.</w:t>
       </w:r>
     </w:p>
     <w:p>
@@ -4229,7 +4229,7 @@
         <w:t xml:space="preserve"> </w:t>
       </w:r>
       <w:r>
-        <w:t xml:space="preserve">in Proc. ICLR, 2023.</w:t>
+        <w:t xml:space="preserve">in Proc. International Conference on Learning Representations (ICLR), 2023.</w:t>
       </w:r>
     </w:p>
     <w:p>
@@ -4249,7 +4249,7 @@
         <w:t xml:space="preserve"> </w:t>
       </w:r>
       <w:r>
-        <w:t xml:space="preserve">in Proc. CVPR, 2022.</w:t>
+        <w:t xml:space="preserve">in Proc. IEEE/CVF Conference on Computer Vision and Pattern Recognition (CVPR), 2022.</w:t>
       </w:r>
     </w:p>
     <w:p>
@@ -4269,7 +4269,7 @@
         <w:t xml:space="preserve"> </w:t>
       </w:r>
       <w:r>
-        <w:t xml:space="preserve">in Proc. 4th International IEEE Workshop on 3D Representation and Recognition, 2013.</w:t>
+        <w:t xml:space="preserve">in Proc. IEEE International Conference on Computer Vision Workshops (ICCV Workshops), pp. 554-561, 2013, doi: 10.1109/ICCVW.2013.77.</w:t>
       </w:r>
     </w:p>
     <w:p>
@@ -4289,7 +4289,7 @@
         <w:t xml:space="preserve"> </w:t>
       </w:r>
       <w:r>
-        <w:t xml:space="preserve">AI, vol. 2, no. 4, pp. 684-704, 2021.</w:t>
+        <w:t xml:space="preserve">AI, vol. 2, no. 4, pp. 684-704, 2021, doi: 10.3390/ai2040041.</w:t>
       </w:r>
     </w:p>
     <w:p>
@@ -4329,7 +4329,7 @@
         <w:t xml:space="preserve"> </w:t>
       </w:r>
       <w:r>
-        <w:t xml:space="preserve">arXiv:2312.14238, 2023.</w:t>
+        <w:t xml:space="preserve">in Proc. IEEE/CVF Conference on Computer Vision and Pattern Recognition (CVPR), pp. 24185-24198, 2024.</w:t>
       </w:r>
     </w:p>
     <w:p>
@@ -4337,19 +4337,19 @@
         <w:pStyle w:val="BodyText"/>
       </w:pPr>
       <w:r>
-        <w:t xml:space="preserve">[18] Z. Chen et al.,</w:t>
-      </w:r>
-      <w:r>
-        <w:t xml:space="preserve"> </w:t>
-      </w:r>
-      <w:r>
-        <w:t xml:space="preserve">“How Far Are We to GPT-4V? Closing the Gap to Commercial Multimodal Models with Open-Source Suites,”</w:t>
-      </w:r>
-      <w:r>
-        <w:t xml:space="preserve"> </w:t>
-      </w:r>
-      <w:r>
-        <w:t xml:space="preserve">arXiv:2404.16821, 2024.</w:t>
+        <w:t xml:space="preserve">[18] OpenGVLab,</w:t>
+      </w:r>
+      <w:r>
+        <w:t xml:space="preserve"> </w:t>
+      </w:r>
+      <w:r>
+        <w:t xml:space="preserve">“OpenGVLab/InternVL2-8B,”</w:t>
+      </w:r>
+      <w:r>
+        <w:t xml:space="preserve"> </w:t>
+      </w:r>
+      <w:r>
+        <w:t xml:space="preserve">Hugging Face model card, 2024. Available: https://huggingface.co/OpenGVLab/InternVL2-8B.</w:t>
       </w:r>
     </w:p>
     <w:bookmarkEnd w:id="47"/>

</xml_diff>